<commit_message>
Added SRS Mapping Table and corrected an small error in the Assignments Explanation
</commit_message>
<xml_diff>
--- a/01_Standards/Milestone_1_Component_Diagram/Examples and Explanations/Milestone_1_Team_Assignments_&_Explanations.docx
+++ b/01_Standards/Milestone_1_Component_Diagram/Examples and Explanations/Milestone_1_Team_Assignments_&_Explanations.docx
@@ -406,15 +406,7 @@
       </w:pPr>
       <w:r>
         <w:lastRenderedPageBreak/>
-        <w:t xml:space="preserve">Sketch Diagram </w:t>
-      </w:r>
-      <w:proofErr w:type="gramStart"/>
-      <w:r>
-        <w:t>With</w:t>
-      </w:r>
-      <w:proofErr w:type="gramEnd"/>
-      <w:r>
-        <w:t xml:space="preserve"> Assignments</w:t>
+        <w:t>Sketch Diagram With Assignments</w:t>
       </w:r>
     </w:p>
     <w:p>
@@ -521,11 +513,7 @@
         <w:t>Admin Team</w:t>
       </w:r>
       <w:r>
-        <w:t xml:space="preserve"> (</w:t>
-      </w:r>
-      <w:proofErr w:type="gramStart"/>
-      <w:r>
-        <w:t xml:space="preserve">Jeremy) </w:t>
+        <w:t xml:space="preserve"> (Jeremy) </w:t>
       </w:r>
       <w:r>
         <w:t xml:space="preserve"> </w:t>
@@ -533,7 +521,6 @@
       <w:r>
         <w:tab/>
       </w:r>
-      <w:proofErr w:type="gramEnd"/>
       <w:r>
         <w:tab/>
       </w:r>
@@ -564,11 +551,7 @@
         <w:t>Team 3 (</w:t>
       </w:r>
       <w:r>
-        <w:t xml:space="preserve">Spencer </w:t>
-      </w:r>
-      <w:proofErr w:type="gramStart"/>
-      <w:r>
-        <w:t>Beals</w:t>
+        <w:t>Spencer Beals</w:t>
       </w:r>
       <w:r>
         <w:t xml:space="preserve">) </w:t>
@@ -578,11 +561,7 @@
       </w:r>
       <w:r>
         <w:tab/>
-        <w:t>—</w:t>
-      </w:r>
-      <w:proofErr w:type="gramEnd"/>
-      <w:r>
-        <w:t xml:space="preserve">&gt; </w:t>
+        <w:t xml:space="preserve">—&gt; </w:t>
       </w:r>
       <w:r>
         <w:t>Web Client</w:t>
@@ -605,11 +584,7 @@
         <w:t>Team 3 (</w:t>
       </w:r>
       <w:r>
-        <w:t xml:space="preserve">Spencer </w:t>
-      </w:r>
-      <w:proofErr w:type="gramStart"/>
-      <w:r>
-        <w:t>Beals</w:t>
+        <w:t>Spencer Beals</w:t>
       </w:r>
       <w:r>
         <w:t xml:space="preserve">) </w:t>
@@ -619,11 +594,7 @@
       </w:r>
       <w:r>
         <w:tab/>
-        <w:t>—</w:t>
-      </w:r>
-      <w:proofErr w:type="gramEnd"/>
-      <w:r>
-        <w:t xml:space="preserve">&gt; </w:t>
+        <w:t xml:space="preserve">—&gt; </w:t>
       </w:r>
       <w:r>
         <w:t>Mobile Client</w:t>
@@ -642,22 +613,14 @@
         <w:t>Team 6 (</w:t>
       </w:r>
       <w:r>
-        <w:t xml:space="preserve">Robert </w:t>
-      </w:r>
-      <w:proofErr w:type="gramStart"/>
-      <w:r>
-        <w:t>Anderson</w:t>
+        <w:t>Robert Anderson</w:t>
       </w:r>
       <w:r>
         <w:t xml:space="preserve">) </w:t>
       </w:r>
       <w:r>
         <w:tab/>
-        <w:t>—</w:t>
-      </w:r>
-      <w:proofErr w:type="gramEnd"/>
-      <w:r>
-        <w:t xml:space="preserve">&gt; </w:t>
+        <w:t xml:space="preserve">—&gt; </w:t>
       </w:r>
       <w:r>
         <w:t>API Gateway / Orchestrator</w:t>
@@ -680,11 +643,7 @@
         <w:t>Team 4 (</w:t>
       </w:r>
       <w:r>
-        <w:t xml:space="preserve">Kimberly </w:t>
-      </w:r>
-      <w:proofErr w:type="gramStart"/>
-      <w:r>
-        <w:t>Uresti</w:t>
+        <w:t>Kimberly Uresti</w:t>
       </w:r>
       <w:r>
         <w:t xml:space="preserve">) </w:t>
@@ -694,11 +653,7 @@
       </w:r>
       <w:r>
         <w:tab/>
-        <w:t>—</w:t>
-      </w:r>
-      <w:proofErr w:type="gramEnd"/>
-      <w:r>
-        <w:t xml:space="preserve">&gt; </w:t>
+        <w:t xml:space="preserve">—&gt; </w:t>
       </w:r>
       <w:r>
         <w:t>Authentication Service</w:t>
@@ -721,11 +676,7 @@
         <w:t>Team 4 (</w:t>
       </w:r>
       <w:r>
-        <w:t xml:space="preserve">Kimberly </w:t>
-      </w:r>
-      <w:proofErr w:type="gramStart"/>
-      <w:r>
-        <w:t>Uresti</w:t>
+        <w:t>Kimberly Uresti</w:t>
       </w:r>
       <w:r>
         <w:t xml:space="preserve">) </w:t>
@@ -735,11 +686,7 @@
       </w:r>
       <w:r>
         <w:tab/>
-        <w:t>—</w:t>
-      </w:r>
-      <w:proofErr w:type="gramEnd"/>
-      <w:r>
-        <w:t xml:space="preserve">&gt; </w:t>
+        <w:t xml:space="preserve">—&gt; </w:t>
       </w:r>
       <w:r>
         <w:t>Profile Management Service</w:t>
@@ -758,11 +705,7 @@
         <w:t>Team 7 (</w:t>
       </w:r>
       <w:r>
-        <w:t xml:space="preserve">Marco </w:t>
-      </w:r>
-      <w:proofErr w:type="gramStart"/>
-      <w:r>
-        <w:t>Quintero</w:t>
+        <w:t>Marco Quintero</w:t>
       </w:r>
       <w:r>
         <w:t xml:space="preserve">) </w:t>
@@ -772,11 +715,7 @@
       </w:r>
       <w:r>
         <w:tab/>
-        <w:t>—</w:t>
-      </w:r>
-      <w:proofErr w:type="gramEnd"/>
-      <w:r>
-        <w:t xml:space="preserve">&gt; </w:t>
+        <w:t xml:space="preserve">—&gt; </w:t>
       </w:r>
       <w:r>
         <w:t>Resume Service</w:t>
@@ -799,22 +738,14 @@
         <w:t>Team 2 (</w:t>
       </w:r>
       <w:r>
-        <w:t xml:space="preserve">Savannah </w:t>
-      </w:r>
-      <w:proofErr w:type="gramStart"/>
-      <w:r>
-        <w:t>Harvey</w:t>
+        <w:t>Savannah Harvey</w:t>
       </w:r>
       <w:r>
         <w:t xml:space="preserve">) </w:t>
       </w:r>
       <w:r>
         <w:tab/>
-        <w:t>—</w:t>
-      </w:r>
-      <w:proofErr w:type="gramEnd"/>
-      <w:r>
-        <w:t xml:space="preserve">&gt; </w:t>
+        <w:t xml:space="preserve">—&gt; </w:t>
       </w:r>
       <w:r>
         <w:t>Job Posting Service</w:t>
@@ -837,22 +768,14 @@
         <w:t>Team 2 (</w:t>
       </w:r>
       <w:r>
-        <w:t xml:space="preserve">Savannah </w:t>
-      </w:r>
-      <w:proofErr w:type="gramStart"/>
-      <w:r>
-        <w:t>Harvey</w:t>
+        <w:t>Savannah Harvey</w:t>
       </w:r>
       <w:r>
         <w:t xml:space="preserve">) </w:t>
       </w:r>
       <w:r>
         <w:tab/>
-        <w:t>—</w:t>
-      </w:r>
-      <w:proofErr w:type="gramEnd"/>
-      <w:r>
-        <w:t xml:space="preserve">&gt; </w:t>
+        <w:t xml:space="preserve">—&gt; </w:t>
       </w:r>
       <w:r>
         <w:t>Search Service</w:t>
@@ -874,22 +797,14 @@
         <w:t>Team 6 (</w:t>
       </w:r>
       <w:r>
-        <w:t xml:space="preserve">Robert </w:t>
-      </w:r>
-      <w:proofErr w:type="gramStart"/>
-      <w:r>
-        <w:t>Anderson</w:t>
+        <w:t>Robert Anderson</w:t>
       </w:r>
       <w:r>
         <w:t xml:space="preserve">) </w:t>
       </w:r>
       <w:r>
         <w:tab/>
-        <w:t>—</w:t>
-      </w:r>
-      <w:proofErr w:type="gramEnd"/>
-      <w:r>
-        <w:t xml:space="preserve">&gt; </w:t>
+        <w:t xml:space="preserve">—&gt; </w:t>
       </w:r>
       <w:r>
         <w:t>Com Services (Notifications + News Feed)</w:t>
@@ -908,11 +823,7 @@
         <w:t>Team 7 (</w:t>
       </w:r>
       <w:r>
-        <w:t xml:space="preserve">Marco </w:t>
-      </w:r>
-      <w:proofErr w:type="gramStart"/>
-      <w:r>
-        <w:t>Quintero</w:t>
+        <w:t>Marco Quintero</w:t>
       </w:r>
       <w:r>
         <w:t xml:space="preserve">) </w:t>
@@ -922,11 +833,7 @@
       </w:r>
       <w:r>
         <w:tab/>
-        <w:t>—</w:t>
-      </w:r>
-      <w:proofErr w:type="gramEnd"/>
-      <w:r>
-        <w:t xml:space="preserve">&gt; </w:t>
+        <w:t xml:space="preserve">—&gt; </w:t>
       </w:r>
       <w:r>
         <w:t>Recommendation Service</w:t>
@@ -949,11 +856,7 @@
         <w:t>Team 5 (</w:t>
       </w:r>
       <w:r>
-        <w:t xml:space="preserve">Adam </w:t>
-      </w:r>
-      <w:proofErr w:type="gramStart"/>
-      <w:r>
-        <w:t>Sheridan</w:t>
+        <w:t>Adam Sheridan</w:t>
       </w:r>
       <w:r>
         <w:t xml:space="preserve">) </w:t>
@@ -963,11 +866,7 @@
       </w:r>
       <w:r>
         <w:tab/>
-        <w:t>—</w:t>
-      </w:r>
-      <w:proofErr w:type="gramEnd"/>
-      <w:r>
-        <w:t xml:space="preserve">&gt; </w:t>
+        <w:t xml:space="preserve">—&gt; </w:t>
       </w:r>
       <w:r>
         <w:t>External Services</w:t>
@@ -989,11 +888,7 @@
         <w:t>Team 5 (</w:t>
       </w:r>
       <w:r>
-        <w:t xml:space="preserve">Adam </w:t>
-      </w:r>
-      <w:proofErr w:type="gramStart"/>
-      <w:r>
-        <w:t>Sheridan</w:t>
+        <w:t>Adam Sheridan</w:t>
       </w:r>
       <w:r>
         <w:t xml:space="preserve">) </w:t>
@@ -1003,11 +898,7 @@
       </w:r>
       <w:r>
         <w:tab/>
-        <w:t>—</w:t>
-      </w:r>
-      <w:proofErr w:type="gramEnd"/>
-      <w:r>
-        <w:t xml:space="preserve">&gt; </w:t>
+        <w:t xml:space="preserve">—&gt; </w:t>
       </w:r>
       <w:r>
         <w:t>Analytics Service</w:t>
@@ -1030,11 +921,7 @@
         <w:t>Admin Team</w:t>
       </w:r>
       <w:r>
-        <w:t xml:space="preserve"> (</w:t>
-      </w:r>
-      <w:proofErr w:type="gramStart"/>
-      <w:r>
-        <w:t xml:space="preserve">Jeremy) </w:t>
+        <w:t xml:space="preserve"> (Jeremy) </w:t>
       </w:r>
       <w:r>
         <w:t xml:space="preserve"> </w:t>
@@ -1042,7 +929,6 @@
       <w:r>
         <w:tab/>
       </w:r>
-      <w:proofErr w:type="gramEnd"/>
       <w:r>
         <w:tab/>
       </w:r>
@@ -1432,7 +1318,7 @@
                 <w:color w:val="156082" w:themeColor="accent1"/>
                 <w:sz w:val="22"/>
               </w:rPr>
-              <w:t>Parent</w:t>
+              <w:t>Child</w:t>
             </w:r>
             <w:r>
               <w:rPr>
@@ -1440,7 +1326,15 @@
                 <w:color w:val="156082" w:themeColor="accent1"/>
                 <w:sz w:val="22"/>
               </w:rPr>
-              <w:t xml:space="preserve"> Component</w:t>
+              <w:t xml:space="preserve"> </w:t>
+            </w:r>
+            <w:r>
+              <w:rPr>
+                <w:rFonts w:eastAsia="Times New Roman" w:cs="Times New Roman"/>
+                <w:color w:val="156082" w:themeColor="accent1"/>
+                <w:sz w:val="22"/>
+              </w:rPr>
+              <w:t>Component</w:t>
             </w:r>
           </w:p>
         </w:tc>
@@ -1577,7 +1471,7 @@
                 <w:color w:val="156082" w:themeColor="accent1"/>
                 <w:sz w:val="22"/>
               </w:rPr>
-              <w:t>Parent</w:t>
+              <w:t>Child</w:t>
             </w:r>
             <w:r>
               <w:rPr>
@@ -3189,21 +3083,7 @@
               <w:rPr>
                 <w:rFonts w:eastAsia="Times New Roman" w:cs="Times New Roman"/>
               </w:rPr>
-              <w:t xml:space="preserve">• All persistent data storage for profiles, resumes, job postings, notifications, news </w:t>
-            </w:r>
-            <w:proofErr w:type="gramStart"/>
-            <w:r>
-              <w:rPr>
-                <w:rFonts w:eastAsia="Times New Roman" w:cs="Times New Roman"/>
-              </w:rPr>
-              <w:t>feed</w:t>
-            </w:r>
-            <w:proofErr w:type="gramEnd"/>
-            <w:r>
-              <w:rPr>
-                <w:rFonts w:eastAsia="Times New Roman" w:cs="Times New Roman"/>
-              </w:rPr>
-              <w:t>, authentication, etc.</w:t>
+              <w:t>• All persistent data storage for profiles, resumes, job postings, notifications, news feed, authentication, etc.</w:t>
             </w:r>
           </w:p>
           <w:p>
@@ -3471,10 +3351,10 @@
         <w:tblLook w:val="04A0" w:firstRow="1" w:lastRow="0" w:firstColumn="1" w:lastColumn="0" w:noHBand="0" w:noVBand="1"/>
       </w:tblPr>
       <w:tblGrid>
-        <w:gridCol w:w="1471"/>
-        <w:gridCol w:w="2491"/>
+        <w:gridCol w:w="1472"/>
+        <w:gridCol w:w="2489"/>
         <w:gridCol w:w="2842"/>
-        <w:gridCol w:w="2496"/>
+        <w:gridCol w:w="2497"/>
       </w:tblGrid>
       <w:tr>
         <w:trPr>
@@ -4816,7 +4696,7 @@
     <w:p>
       <w:r>
         <w:pict w14:anchorId="144EC362">
-          <v:rect id="_x0000_i1028" style="width:0;height:1.5pt" o:hralign="center" o:hrstd="t" o:hr="t" fillcolor="#a0a0a0" stroked="f"/>
+          <v:rect id="_x0000_i1026" style="width:0;height:1.5pt" o:hralign="center" o:hrstd="t" o:hr="t" fillcolor="#a0a0a0" stroked="f"/>
         </w:pict>
       </w:r>
     </w:p>
@@ -4903,15 +4783,7 @@
         <w:t xml:space="preserve">each </w:t>
       </w:r>
       <w:r>
-        <w:t xml:space="preserve">have two components — you can combine them into one sub-diagram if it makes </w:t>
-      </w:r>
-      <w:proofErr w:type="gramStart"/>
-      <w:r>
-        <w:t>sense, or</w:t>
-      </w:r>
-      <w:proofErr w:type="gramEnd"/>
-      <w:r>
-        <w:t xml:space="preserve"> do two separate ones. Either is fine.</w:t>
+        <w:t>have two components — you can combine them into one sub-diagram if it makes sense, or do two separate ones. Either is fine.</w:t>
       </w:r>
     </w:p>
     <w:p>

</xml_diff>